<commit_message>
Web: stop browsers from keeping an old app.js (version query + .htaccess no-cache)
Co-Authored-By: Claude Opus 5.5 <noreply@anthropic.com>
Claude-Session: https://claude.ai/code/session_01LUEXdLPnpgGnWTyNRXft8r
</commit_message>
<xml_diff>
--- a/rayy-mysql/docs/Rayy-Documentation-MySQL.docx
+++ b/rayy-mysql/docs/Rayy-Documentation-MySQL.docx
@@ -19195,6 +19195,140 @@
             </w:pPr>
             <w:r>
               <w:t xml:space="preserve">Solution</w:t>
+            </w:r>
+          </w:p>
+        </w:tc>
+      </w:tr>
+      <w:tr>
+        <w:tc>
+          <w:tcPr/>
+          <w:p>
+            <w:pPr>
+              <w:pStyle w:val="Compact"/>
+            </w:pPr>
+            <w:r>
+              <w:t xml:space="preserve">Page shows words like</w:t>
+            </w:r>
+            <w:r>
+              <w:t xml:space="preserve"> </w:t>
+            </w:r>
+            <w:r>
+              <w:rPr>
+                <w:rStyle w:val="VerbatimChar"/>
+              </w:rPr>
+              <w:t xml:space="preserve">navCrops</w:t>
+            </w:r>
+            <w:r>
+              <w:t xml:space="preserve">,</w:t>
+            </w:r>
+            <w:r>
+              <w:t xml:space="preserve"> </w:t>
+            </w:r>
+            <w:r>
+              <w:rPr>
+                <w:rStyle w:val="VerbatimChar"/>
+              </w:rPr>
+              <w:t xml:space="preserve">myCrops</w:t>
+            </w:r>
+            <w:r>
+              <w:t xml:space="preserve"> </w:t>
+            </w:r>
+            <w:r>
+              <w:t xml:space="preserve">or</w:t>
+            </w:r>
+            <w:r>
+              <w:t xml:space="preserve"> </w:t>
+            </w:r>
+            <w:r>
+              <w:t xml:space="preserve">“Missing crop id”</w:t>
+            </w:r>
+          </w:p>
+        </w:tc>
+        <w:tc>
+          <w:tcPr/>
+          <w:p>
+            <w:pPr>
+              <w:pStyle w:val="Compact"/>
+            </w:pPr>
+            <w:r>
+              <w:t xml:space="preserve">The browser kept an</w:t>
+            </w:r>
+            <w:r>
+              <w:t xml:space="preserve"> </w:t>
+            </w:r>
+            <w:r>
+              <w:rPr>
+                <w:b/>
+                <w:bCs/>
+              </w:rPr>
+              <w:t xml:space="preserve">old</w:t>
+            </w:r>
+            <w:r>
+              <w:rPr>
+                <w:b/>
+                <w:bCs/>
+              </w:rPr>
+              <w:t xml:space="preserve"> </w:t>
+            </w:r>
+            <w:r>
+              <w:rPr>
+                <w:rStyle w:val="VerbatimChar"/>
+                <w:b/>
+                <w:bCs/>
+              </w:rPr>
+              <w:t xml:space="preserve">app.js</w:t>
+            </w:r>
+            <w:r>
+              <w:t xml:space="preserve"> </w:t>
+            </w:r>
+            <w:r>
+              <w:t xml:space="preserve">from a previous version: press</w:t>
+            </w:r>
+            <w:r>
+              <w:t xml:space="preserve"> </w:t>
+            </w:r>
+            <w:r>
+              <w:rPr>
+                <w:b/>
+                <w:bCs/>
+              </w:rPr>
+              <w:t xml:space="preserve">Ctrl + F5</w:t>
+            </w:r>
+            <w:r>
+              <w:t xml:space="preserve"> </w:t>
+            </w:r>
+            <w:r>
+              <w:t xml:space="preserve">(or clear the browsing data) once. The project now adds</w:t>
+            </w:r>
+            <w:r>
+              <w:t xml:space="preserve"> </w:t>
+            </w:r>
+            <w:r>
+              <w:rPr>
+                <w:rStyle w:val="VerbatimChar"/>
+              </w:rPr>
+              <w:t xml:space="preserve">?v=</w:t>
+            </w:r>
+            <w:r>
+              <w:t xml:space="preserve"> </w:t>
+            </w:r>
+            <w:r>
+              <w:t xml:space="preserve">to its files and a</w:t>
+            </w:r>
+            <w:r>
+              <w:t xml:space="preserve"> </w:t>
+            </w:r>
+            <w:r>
+              <w:rPr>
+                <w:rStyle w:val="VerbatimChar"/>
+              </w:rPr>
+              <w:t xml:space="preserve">.htaccess</w:t>
+            </w:r>
+            <w:r>
+              <w:t xml:space="preserve"> </w:t>
+            </w:r>
+            <w:r>
+              <w:t xml:space="preserve">so this does not happen again</w:t>
             </w:r>
           </w:p>
         </w:tc>

</xml_diff>